<commit_message>
20250908 Single strain model update
</commit_message>
<xml_diff>
--- a/Analysis/Low H, H as constant.docx
+++ b/Analysis/Low H, H as constant.docx
@@ -34,7 +34,7 @@
                     <pic:cNvPicPr/>
                   </pic:nvPicPr>
                   <pic:blipFill>
-                    <a:blip r:embed="rId4"/>
+                    <a:blip r:embed="rId6"/>
                     <a:stretch>
                       <a:fillRect/>
                     </a:stretch>
@@ -161,7 +161,7 @@
                     </pic:cNvPicPr>
                   </pic:nvPicPr>
                   <pic:blipFill rotWithShape="1">
-                    <a:blip r:embed="rId5">
+                    <a:blip r:embed="rId7">
                       <a:extLst>
                         <a:ext uri="{28A0092B-C50C-407E-A947-70E740481C1C}">
                           <a14:useLocalDpi xmlns:a14="http://schemas.microsoft.com/office/drawing/2010/main" val="0"/>
@@ -217,7 +217,7 @@
                     </pic:cNvPicPr>
                   </pic:nvPicPr>
                   <pic:blipFill>
-                    <a:blip r:embed="rId6">
+                    <a:blip r:embed="rId8">
                       <a:extLst>
                         <a:ext uri="{28A0092B-C50C-407E-A947-70E740481C1C}">
                           <a14:useLocalDpi xmlns:a14="http://schemas.microsoft.com/office/drawing/2010/main" val="0"/>
@@ -251,10 +251,64 @@
         <w:ind w:firstLineChars="100" w:firstLine="240"/>
       </w:pPr>
       <w:r>
-        <w:t>The result shows that in the low H situation (here I set H as a constant with a low value), the competition outcomes do not always follow the exploitative competition outcomes.</w:t>
+        <w:t>The result shows that in the low H situation (here I set H as a constant with a low value), the competition outcomes do not always follow the</w:t>
+      </w:r>
+      <w:r>
+        <w:rPr>
+          <w:rFonts w:hint="eastAsia"/>
+        </w:rPr>
+        <w:t xml:space="preserve"> s</w:t>
+      </w:r>
+      <w:r>
+        <w:t>imple S* rule, where the system only leaves P1, P2, and S</w:t>
+      </w:r>
+      <w:r>
+        <w:t>.</w:t>
+      </w:r>
+      <w:r>
+        <w:t xml:space="preserve"> Some of the grids show the reverse competition outcome.</w:t>
+      </w:r>
+    </w:p>
+    <w:p>
+      <w:pPr>
+        <w:ind w:firstLineChars="100" w:firstLine="240"/>
+      </w:pPr>
+      <w:r>
+        <w:t>From the result, one can tell that even a low abundance</w:t>
+      </w:r>
+      <w:r>
+        <w:t xml:space="preserve"> </w:t>
+      </w:r>
+      <w:r>
+        <w:t>of H can</w:t>
+      </w:r>
+      <w:r>
+        <w:t xml:space="preserve"> </w:t>
+      </w:r>
+      <w:r>
+        <w:t>influence</w:t>
+      </w:r>
+      <w:r>
+        <w:t xml:space="preserve"> the system. Thus, one cannot predict the competition outcome with the simple S* rule. So</w:t>
+      </w:r>
+      <w:r>
+        <w:t xml:space="preserve">, </w:t>
+      </w:r>
+      <w:r>
+        <w:rPr>
+          <w:rFonts w:hint="eastAsia"/>
+        </w:rPr>
+        <w:t>I</w:t>
+      </w:r>
+      <w:r>
+        <w:t xml:space="preserve"> come up with a new question: When can we ignore the effect of H</w:t>
+      </w:r>
+      <w:r>
+        <w:t xml:space="preserve"> and predict the competition outcome with the simple S* rule?</w:t>
       </w:r>
     </w:p>
     <w:p/>
+    <w:p/>
     <w:p>
       <w:r>
         <w:rPr>
@@ -286,89 +340,7 @@
         <w:rPr>
           <w:noProof/>
         </w:rPr>
-        <mc:AlternateContent>
-          <mc:Choice Requires="wps">
-            <w:drawing>
-              <wp:anchor distT="0" distB="0" distL="114300" distR="114300" simplePos="0" relativeHeight="251660288" behindDoc="0" locked="0" layoutInCell="1" allowOverlap="1">
-                <wp:simplePos x="0" y="0"/>
-                <wp:positionH relativeFrom="column">
-                  <wp:posOffset>1458184</wp:posOffset>
-                </wp:positionH>
-                <wp:positionV relativeFrom="paragraph">
-                  <wp:posOffset>1215049</wp:posOffset>
-                </wp:positionV>
-                <wp:extent cx="358885" cy="184994"/>
-                <wp:effectExtent l="19050" t="19050" r="22225" b="24765"/>
-                <wp:wrapNone/>
-                <wp:docPr id="1" name="矩形 1"/>
-                <wp:cNvGraphicFramePr/>
-                <a:graphic xmlns:a="http://schemas.openxmlformats.org/drawingml/2006/main">
-                  <a:graphicData uri="http://schemas.microsoft.com/office/word/2010/wordprocessingShape">
-                    <wps:wsp>
-                      <wps:cNvSpPr/>
-                      <wps:spPr>
-                        <a:xfrm>
-                          <a:off x="0" y="0"/>
-                          <a:ext cx="358885" cy="184994"/>
-                        </a:xfrm>
-                        <a:prstGeom prst="rect">
-                          <a:avLst/>
-                        </a:prstGeom>
-                        <a:noFill/>
-                        <a:ln w="28575">
-                          <a:solidFill>
-                            <a:srgbClr val="002060"/>
-                          </a:solidFill>
-                          <a:prstDash val="sysDash"/>
-                        </a:ln>
-                      </wps:spPr>
-                      <wps:style>
-                        <a:lnRef idx="2">
-                          <a:schemeClr val="accent1">
-                            <a:shade val="50000"/>
-                          </a:schemeClr>
-                        </a:lnRef>
-                        <a:fillRef idx="1">
-                          <a:schemeClr val="accent1"/>
-                        </a:fillRef>
-                        <a:effectRef idx="0">
-                          <a:schemeClr val="accent1"/>
-                        </a:effectRef>
-                        <a:fontRef idx="minor">
-                          <a:schemeClr val="lt1"/>
-                        </a:fontRef>
-                      </wps:style>
-                      <wps:bodyPr rot="0" spcFirstLastPara="0" vertOverflow="overflow" horzOverflow="overflow" vert="horz" wrap="square" lIns="91440" tIns="45720" rIns="91440" bIns="45720" numCol="1" spcCol="0" rtlCol="0" fromWordArt="0" anchor="ctr" anchorCtr="0" forceAA="0" compatLnSpc="1">
-                        <a:prstTxWarp prst="textNoShape">
-                          <a:avLst/>
-                        </a:prstTxWarp>
-                        <a:noAutofit/>
-                      </wps:bodyPr>
-                    </wps:wsp>
-                  </a:graphicData>
-                </a:graphic>
-                <wp14:sizeRelH relativeFrom="margin">
-                  <wp14:pctWidth>0</wp14:pctWidth>
-                </wp14:sizeRelH>
-                <wp14:sizeRelV relativeFrom="margin">
-                  <wp14:pctHeight>0</wp14:pctHeight>
-                </wp14:sizeRelV>
-              </wp:anchor>
-            </w:drawing>
-          </mc:Choice>
-          <mc:Fallback>
-            <w:pict>
-              <v:rect w14:anchorId="5A0125C0" id="矩形 1" o:spid="_x0000_s1026" style="position:absolute;margin-left:114.8pt;margin-top:95.65pt;width:28.25pt;height:14.55pt;z-index:251660288;visibility:visible;mso-wrap-style:square;mso-width-percent:0;mso-height-percent:0;mso-wrap-distance-left:9pt;mso-wrap-distance-top:0;mso-wrap-distance-right:9pt;mso-wrap-distance-bottom:0;mso-position-horizontal:absolute;mso-position-horizontal-relative:text;mso-position-vertical:absolute;mso-position-vertical-relative:text;mso-width-percent:0;mso-height-percent:0;mso-width-relative:margin;mso-height-relative:margin;v-text-anchor:middle" o:gfxdata="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" filled="f" strokecolor="#002060" strokeweight="2.25pt">
-                <v:stroke dashstyle="3 1"/>
-              </v:rect>
-            </w:pict>
-          </mc:Fallback>
-        </mc:AlternateContent>
-      </w:r>
-      <w:r>
-        <w:rPr>
-          <w:noProof/>
-        </w:rPr>
+        <w:lastRenderedPageBreak/>
         <w:drawing>
           <wp:inline distT="0" distB="0" distL="0" distR="0" wp14:anchorId="095DE914" wp14:editId="72C35E55">
             <wp:extent cx="3203043" cy="2355049"/>
@@ -387,7 +359,7 @@
                     </pic:cNvPicPr>
                   </pic:nvPicPr>
                   <pic:blipFill>
-                    <a:blip r:embed="rId7" cstate="print">
+                    <a:blip r:embed="rId9" cstate="print">
                       <a:extLst>
                         <a:ext uri="{28A0092B-C50C-407E-A947-70E740481C1C}">
                           <a14:useLocalDpi xmlns:a14="http://schemas.microsoft.com/office/drawing/2010/main" val="0"/>
@@ -437,7 +409,7 @@
                     </pic:cNvPicPr>
                   </pic:nvPicPr>
                   <pic:blipFill>
-                    <a:blip r:embed="rId8">
+                    <a:blip r:embed="rId10">
                       <a:extLst>
                         <a:ext uri="{28A0092B-C50C-407E-A947-70E740481C1C}">
                           <a14:useLocalDpi xmlns:a14="http://schemas.microsoft.com/office/drawing/2010/main" val="0"/>
@@ -474,7 +446,10 @@
         <w:t>where H is a</w:t>
       </w:r>
       <w:r>
-        <w:t xml:space="preserve"> state variable.</w:t>
+        <w:t xml:space="preserve"> state variable</w:t>
+      </w:r>
+      <w:r>
+        <w:t xml:space="preserve"> and is not limited to a specific value.</w:t>
       </w:r>
     </w:p>
     <w:p/>
@@ -482,21 +457,12 @@
       <w:pPr>
         <w:widowControl/>
       </w:pPr>
-      <w:r>
-        <w:br w:type="page"/>
-      </w:r>
-    </w:p>
-    <w:p>
-      <w:pPr>
+    </w:p>
+    <w:p>
+      <w:r>
         <w:rPr>
           <w:rFonts w:hint="eastAsia"/>
         </w:rPr>
-      </w:pPr>
-      <w:r>
-        <w:rPr>
-          <w:rFonts w:hint="eastAsia"/>
-        </w:rPr>
-        <w:lastRenderedPageBreak/>
         <w:t>P</w:t>
       </w:r>
       <w:r>
@@ -707,7 +673,7 @@
                     </pic:cNvPicPr>
                   </pic:nvPicPr>
                   <pic:blipFill>
-                    <a:blip r:embed="rId7" cstate="print">
+                    <a:blip r:embed="rId9" cstate="print">
                       <a:extLst>
                         <a:ext uri="{28A0092B-C50C-407E-A947-70E740481C1C}">
                           <a14:useLocalDpi xmlns:a14="http://schemas.microsoft.com/office/drawing/2010/main" val="0"/>
@@ -757,7 +723,7 @@
                     </pic:cNvPicPr>
                   </pic:nvPicPr>
                   <pic:blipFill>
-                    <a:blip r:embed="rId8">
+                    <a:blip r:embed="rId10">
                       <a:extLst>
                         <a:ext uri="{28A0092B-C50C-407E-A947-70E740481C1C}">
                           <a14:useLocalDpi xmlns:a14="http://schemas.microsoft.com/office/drawing/2010/main" val="0"/>
@@ -786,89 +752,12 @@
         </w:drawing>
       </w:r>
     </w:p>
-    <w:p>
-      <w:r>
-        <w:rPr>
-          <w:rFonts w:hint="eastAsia"/>
-        </w:rPr>
-        <w:t>W</w:t>
-      </w:r>
-      <w:r>
-        <w:t xml:space="preserve">hen </w:t>
-      </w:r>
-      <w:r>
-        <w:rPr>
-          <w:rFonts w:ascii="Times New Roman" w:hAnsi="Times New Roman" w:cs="Times New Roman"/>
-        </w:rPr>
-        <w:t>α</w:t>
-      </w:r>
-      <w:r>
-        <w:rPr>
-          <w:vertAlign w:val="subscript"/>
-        </w:rPr>
-        <w:t>1</w:t>
-      </w:r>
-      <w:r>
-        <w:t xml:space="preserve"> = 0.35 and </w:t>
-      </w:r>
-      <w:r>
-        <w:rPr>
-          <w:rFonts w:ascii="Times New Roman" w:hAnsi="Times New Roman" w:cs="Times New Roman"/>
-        </w:rPr>
-        <w:t>β</w:t>
-      </w:r>
-      <w:r>
-        <w:rPr>
-          <w:vertAlign w:val="subscript"/>
-        </w:rPr>
-        <w:t>1</w:t>
-      </w:r>
-      <w:r>
-        <w:t xml:space="preserve"> = 0.2; </w:t>
-      </w:r>
-      <w:r>
-        <w:rPr>
-          <w:rFonts w:ascii="Times New Roman" w:hAnsi="Times New Roman" w:cs="Times New Roman"/>
-        </w:rPr>
-        <w:t>α</w:t>
-      </w:r>
-      <w:r>
-        <w:rPr>
-          <w:vertAlign w:val="subscript"/>
-        </w:rPr>
-        <w:t>2</w:t>
-      </w:r>
-      <w:r>
-        <w:t xml:space="preserve"> = 0.5 and </w:t>
-      </w:r>
-      <w:r>
-        <w:rPr>
-          <w:rFonts w:ascii="Times New Roman" w:hAnsi="Times New Roman" w:cs="Times New Roman"/>
-        </w:rPr>
-        <w:t>β</w:t>
-      </w:r>
-      <w:r>
-        <w:rPr>
-          <w:vertAlign w:val="subscript"/>
-        </w:rPr>
-        <w:t>2</w:t>
-      </w:r>
-      <w:r>
-        <w:t xml:space="preserve"> = 0.</w:t>
-      </w:r>
-      <w:r>
-        <w:t>4</w:t>
-      </w:r>
-      <w:r>
-        <w:t>5</w:t>
-      </w:r>
-      <w:r>
-        <w:t>:</w:t>
-      </w:r>
-    </w:p>
     <w:p/>
     <w:p>
       <w:r>
+        <w:rPr>
+          <w:noProof/>
+        </w:rPr>
         <w:drawing>
           <wp:inline distT="0" distB="0" distL="0" distR="0" wp14:anchorId="1527CDD1" wp14:editId="7781C3C8">
             <wp:extent cx="3549650" cy="1644650"/>
@@ -885,7 +774,7 @@
                     <pic:cNvPicPr/>
                   </pic:nvPicPr>
                   <pic:blipFill>
-                    <a:blip r:embed="rId9"/>
+                    <a:blip r:embed="rId11"/>
                     <a:stretch>
                       <a:fillRect/>
                     </a:stretch>
@@ -905,10 +794,29 @@
           </wp:inline>
         </w:drawing>
       </w:r>
-    </w:p>
-    <w:p>
-      <w:r>
-        <w:t>If there is a time separation between H and the other state variable, P</w:t>
+      <w:bookmarkStart w:id="0" w:name="_GoBack"/>
+      <w:bookmarkEnd w:id="0"/>
+    </w:p>
+    <w:p>
+      <w:pPr>
+        <w:rPr>
+          <w:rFonts w:hint="eastAsia"/>
+        </w:rPr>
+      </w:pPr>
+      <w:r>
+        <w:t>If there is a time</w:t>
+      </w:r>
+      <w:r>
+        <w:rPr>
+          <w:rFonts w:hint="eastAsia"/>
+        </w:rPr>
+        <w:t xml:space="preserve"> s</w:t>
+      </w:r>
+      <w:r>
+        <w:t>cale</w:t>
+      </w:r>
+      <w:r>
+        <w:t xml:space="preserve"> separation between H and the other state variable, P</w:t>
       </w:r>
       <w:r>
         <w:rPr>
@@ -929,12 +837,97 @@
         <w:t xml:space="preserve"> will be excluded if H is smaller than 0.1244.</w:t>
       </w:r>
     </w:p>
-    <w:p/>
+    <w:p>
+      <w:pPr>
+        <w:rPr>
+          <w:rFonts w:hint="eastAsia"/>
+        </w:rPr>
+      </w:pPr>
+    </w:p>
+    <w:p>
+      <w:r>
+        <w:rPr>
+          <w:rFonts w:hint="eastAsia"/>
+        </w:rPr>
+        <w:t>W</w:t>
+      </w:r>
+      <w:r>
+        <w:t xml:space="preserve">hen </w:t>
+      </w:r>
+      <w:r>
+        <w:rPr>
+          <w:rFonts w:ascii="Times New Roman" w:hAnsi="Times New Roman" w:cs="Times New Roman"/>
+        </w:rPr>
+        <w:t>α</w:t>
+      </w:r>
+      <w:r>
+        <w:rPr>
+          <w:vertAlign w:val="subscript"/>
+        </w:rPr>
+        <w:t>1</w:t>
+      </w:r>
+      <w:r>
+        <w:t xml:space="preserve"> = 0.35 and </w:t>
+      </w:r>
+      <w:r>
+        <w:rPr>
+          <w:rFonts w:ascii="Times New Roman" w:hAnsi="Times New Roman" w:cs="Times New Roman"/>
+        </w:rPr>
+        <w:t>β</w:t>
+      </w:r>
+      <w:r>
+        <w:rPr>
+          <w:vertAlign w:val="subscript"/>
+        </w:rPr>
+        <w:t>1</w:t>
+      </w:r>
+      <w:r>
+        <w:t xml:space="preserve"> = 0.2; </w:t>
+      </w:r>
+      <w:r>
+        <w:rPr>
+          <w:rFonts w:ascii="Times New Roman" w:hAnsi="Times New Roman" w:cs="Times New Roman"/>
+        </w:rPr>
+        <w:t>α</w:t>
+      </w:r>
+      <w:r>
+        <w:rPr>
+          <w:vertAlign w:val="subscript"/>
+        </w:rPr>
+        <w:t>2</w:t>
+      </w:r>
+      <w:r>
+        <w:t xml:space="preserve"> = 0.5 and </w:t>
+      </w:r>
+      <w:r>
+        <w:rPr>
+          <w:rFonts w:ascii="Times New Roman" w:hAnsi="Times New Roman" w:cs="Times New Roman"/>
+        </w:rPr>
+        <w:t>β</w:t>
+      </w:r>
+      <w:r>
+        <w:rPr>
+          <w:vertAlign w:val="subscript"/>
+        </w:rPr>
+        <w:t>2</w:t>
+      </w:r>
+      <w:r>
+        <w:t xml:space="preserve"> = 0.45:</w:t>
+      </w:r>
+    </w:p>
+    <w:p>
+      <w:pPr>
+        <w:rPr>
+          <w:rFonts w:hint="eastAsia"/>
+        </w:rPr>
+      </w:pPr>
+    </w:p>
     <w:p>
       <w:r>
         <w:rPr>
           <w:noProof/>
         </w:rPr>
+        <w:lastRenderedPageBreak/>
         <w:drawing>
           <wp:inline distT="0" distB="0" distL="0" distR="0" wp14:anchorId="21AEE092">
             <wp:extent cx="3253826" cy="2415081"/>
@@ -953,7 +946,7 @@
                     </pic:cNvPicPr>
                   </pic:nvPicPr>
                   <pic:blipFill>
-                    <a:blip r:embed="rId10">
+                    <a:blip r:embed="rId12">
                       <a:extLst>
                         <a:ext uri="{28A0092B-C50C-407E-A947-70E740481C1C}">
                           <a14:useLocalDpi xmlns:a14="http://schemas.microsoft.com/office/drawing/2010/main" val="0"/>
@@ -1003,7 +996,7 @@
                     </pic:cNvPicPr>
                   </pic:nvPicPr>
                   <pic:blipFill>
-                    <a:blip r:embed="rId11">
+                    <a:blip r:embed="rId13">
                       <a:extLst>
                         <a:ext uri="{28A0092B-C50C-407E-A947-70E740481C1C}">
                           <a14:useLocalDpi xmlns:a14="http://schemas.microsoft.com/office/drawing/2010/main" val="0"/>
@@ -1051,11 +1044,6 @@
       </w:r>
     </w:p>
     <w:p>
-      <w:pPr>
-        <w:rPr>
-          <w:rFonts w:hint="eastAsia"/>
-        </w:rPr>
-      </w:pPr>
       <w:r>
         <w:rPr>
           <w:rFonts w:hint="eastAsia"/>
@@ -1069,9 +1057,6 @@
     <w:p>
       <w:pPr>
         <w:widowControl/>
-        <w:rPr>
-          <w:rFonts w:hint="eastAsia"/>
-        </w:rPr>
       </w:pPr>
       <w:r>
         <w:br w:type="page"/>
@@ -1101,13 +1086,7 @@
         <w:t>1</w:t>
       </w:r>
       <w:r>
-        <w:t xml:space="preserve"> = 0.</w:t>
-      </w:r>
-      <w:r>
-        <w:t>4</w:t>
-      </w:r>
-      <w:r>
-        <w:t xml:space="preserve"> and </w:t>
+        <w:t xml:space="preserve"> = 0.4 and </w:t>
       </w:r>
       <w:r>
         <w:rPr>
@@ -1175,22 +1154,11 @@
         <w:t>1</w:t>
       </w:r>
       <w:r>
-        <w:t xml:space="preserve"> will be excluded if H is smaller than 0.</w:t>
-      </w:r>
-      <w:r>
-        <w:t>0419</w:t>
-      </w:r>
-      <w:r>
-        <w:t>.</w:t>
+        <w:t xml:space="preserve"> will be excluded if H is smaller than 0.0419.</w:t>
       </w:r>
     </w:p>
     <w:p/>
     <w:p>
-      <w:pPr>
-        <w:rPr>
-          <w:rFonts w:hint="eastAsia"/>
-        </w:rPr>
-      </w:pPr>
       <w:r>
         <w:rPr>
           <w:noProof/>
@@ -1213,7 +1181,7 @@
                     </pic:cNvPicPr>
                   </pic:nvPicPr>
                   <pic:blipFill>
-                    <a:blip r:embed="rId12">
+                    <a:blip r:embed="rId14">
                       <a:extLst>
                         <a:ext uri="{28A0092B-C50C-407E-A947-70E740481C1C}">
                           <a14:useLocalDpi xmlns:a14="http://schemas.microsoft.com/office/drawing/2010/main" val="0"/>
@@ -1263,7 +1231,7 @@
                     </pic:cNvPicPr>
                   </pic:nvPicPr>
                   <pic:blipFill>
-                    <a:blip r:embed="rId13">
+                    <a:blip r:embed="rId15">
                       <a:extLst>
                         <a:ext uri="{28A0092B-C50C-407E-A947-70E740481C1C}">
                           <a14:useLocalDpi xmlns:a14="http://schemas.microsoft.com/office/drawing/2010/main" val="0"/>
@@ -1331,13 +1299,7 @@
         <w:t>1</w:t>
       </w:r>
       <w:r>
-        <w:t xml:space="preserve"> = 0.4</w:t>
-      </w:r>
-      <w:r>
-        <w:t>5</w:t>
-      </w:r>
-      <w:r>
-        <w:t xml:space="preserve"> and </w:t>
+        <w:t xml:space="preserve"> = 0.45 and </w:t>
       </w:r>
       <w:r>
         <w:rPr>
@@ -1405,10 +1367,7 @@
         <w:t>1</w:t>
       </w:r>
       <w:r>
-        <w:t xml:space="preserve"> will be excluded if H is smaller than 0.0</w:t>
-      </w:r>
-      <w:r>
-        <w:t>026.</w:t>
+        <w:t xml:space="preserve"> will be excluded if H is smaller than 0.0026.</w:t>
       </w:r>
     </w:p>
     <w:p>
@@ -1434,7 +1393,7 @@
                     </pic:cNvPicPr>
                   </pic:nvPicPr>
                   <pic:blipFill>
-                    <a:blip r:embed="rId14">
+                    <a:blip r:embed="rId16">
                       <a:extLst>
                         <a:ext uri="{28A0092B-C50C-407E-A947-70E740481C1C}">
                           <a14:useLocalDpi xmlns:a14="http://schemas.microsoft.com/office/drawing/2010/main" val="0"/>
@@ -1484,7 +1443,7 @@
                     </pic:cNvPicPr>
                   </pic:nvPicPr>
                   <pic:blipFill>
-                    <a:blip r:embed="rId15">
+                    <a:blip r:embed="rId17">
                       <a:extLst>
                         <a:ext uri="{28A0092B-C50C-407E-A947-70E740481C1C}">
                           <a14:useLocalDpi xmlns:a14="http://schemas.microsoft.com/office/drawing/2010/main" val="0"/>
@@ -1514,11 +1473,6 @@
       </w:r>
     </w:p>
     <w:p>
-      <w:pPr>
-        <w:rPr>
-          <w:rFonts w:hint="eastAsia"/>
-        </w:rPr>
-      </w:pPr>
       <w:r>
         <w:rPr>
           <w:noProof/>
@@ -1542,7 +1496,7 @@
                     </pic:cNvPicPr>
                   </pic:nvPicPr>
                   <pic:blipFill>
-                    <a:blip r:embed="rId16">
+                    <a:blip r:embed="rId18">
                       <a:extLst>
                         <a:ext uri="{28A0092B-C50C-407E-A947-70E740481C1C}">
                           <a14:useLocalDpi xmlns:a14="http://schemas.microsoft.com/office/drawing/2010/main" val="0"/>
@@ -1572,7 +1526,25 @@
       </w:r>
     </w:p>
     <w:p>
+      <w:r>
+        <w:rPr>
+          <w:rFonts w:hint="eastAsia"/>
+        </w:rPr>
+        <w:t>H</w:t>
+      </w:r>
+      <w:r>
+        <w:t xml:space="preserve"> is extinction here.</w:t>
+      </w:r>
+    </w:p>
+    <w:p>
       <w:pPr>
+        <w:pBdr>
+          <w:bottom w:val="single" w:sz="6" w:space="1" w:color="auto"/>
+        </w:pBdr>
+      </w:pPr>
+    </w:p>
+    <w:p>
+      <w:pPr>
         <w:rPr>
           <w:rFonts w:hint="eastAsia"/>
         </w:rPr>
@@ -1581,15 +1553,194 @@
         <w:rPr>
           <w:rFonts w:hint="eastAsia"/>
         </w:rPr>
-        <w:t>H</w:t>
-      </w:r>
-      <w:r>
-        <w:t xml:space="preserve"> is extinction here</w:t>
-      </w:r>
-      <w:bookmarkStart w:id="0" w:name="_GoBack"/>
-      <w:bookmarkEnd w:id="0"/>
-      <w:r>
-        <w:t>.</w:t>
+        <w:t>I</w:t>
+      </w:r>
+      <w:r>
+        <w:t>f using H* rule.</w:t>
+      </w:r>
+    </w:p>
+    <w:p>
+      <w:pPr>
+        <w:widowControl/>
+      </w:pPr>
+      <w:r>
+        <w:br w:type="page"/>
+      </w:r>
+    </w:p>
+    <w:p>
+      <w:r>
+        <w:rPr>
+          <w:noProof/>
+        </w:rPr>
+        <w:lastRenderedPageBreak/>
+        <w:drawing>
+          <wp:inline distT="0" distB="0" distL="0" distR="0" wp14:anchorId="6CE8C3AE" wp14:editId="1BA803F7">
+            <wp:extent cx="5143764" cy="762039"/>
+            <wp:effectExtent l="0" t="0" r="0" b="0"/>
+            <wp:docPr id="18" name="圖片 18"/>
+            <wp:cNvGraphicFramePr>
+              <a:graphicFrameLocks xmlns:a="http://schemas.openxmlformats.org/drawingml/2006/main" noChangeAspect="1"/>
+            </wp:cNvGraphicFramePr>
+            <a:graphic xmlns:a="http://schemas.openxmlformats.org/drawingml/2006/main">
+              <a:graphicData uri="http://schemas.openxmlformats.org/drawingml/2006/picture">
+                <pic:pic xmlns:pic="http://schemas.openxmlformats.org/drawingml/2006/picture">
+                  <pic:nvPicPr>
+                    <pic:cNvPr id="1" name=""/>
+                    <pic:cNvPicPr/>
+                  </pic:nvPicPr>
+                  <pic:blipFill>
+                    <a:blip r:embed="rId19"/>
+                    <a:stretch>
+                      <a:fillRect/>
+                    </a:stretch>
+                  </pic:blipFill>
+                  <pic:spPr>
+                    <a:xfrm>
+                      <a:off x="0" y="0"/>
+                      <a:ext cx="5143764" cy="762039"/>
+                    </a:xfrm>
+                    <a:prstGeom prst="rect">
+                      <a:avLst/>
+                    </a:prstGeom>
+                  </pic:spPr>
+                </pic:pic>
+              </a:graphicData>
+            </a:graphic>
+          </wp:inline>
+        </w:drawing>
+      </w:r>
+    </w:p>
+    <w:p>
+      <w:r>
+        <w:rPr>
+          <w:rFonts w:hint="eastAsia"/>
+        </w:rPr>
+        <w:t>W</w:t>
+      </w:r>
+      <w:r>
+        <w:t>hen there is a time scale separation on the parameter of H</w:t>
+      </w:r>
+    </w:p>
+    <w:p>
+      <w:r>
+        <w:rPr>
+          <w:noProof/>
+        </w:rPr>
+        <w:drawing>
+          <wp:inline distT="0" distB="0" distL="0" distR="0" wp14:anchorId="3BCA7F40" wp14:editId="2C6B251A">
+            <wp:extent cx="6840220" cy="2948305"/>
+            <wp:effectExtent l="0" t="0" r="0" b="4445"/>
+            <wp:docPr id="1" name="圖片 1"/>
+            <wp:cNvGraphicFramePr>
+              <a:graphicFrameLocks xmlns:a="http://schemas.openxmlformats.org/drawingml/2006/main" noChangeAspect="1"/>
+            </wp:cNvGraphicFramePr>
+            <a:graphic xmlns:a="http://schemas.openxmlformats.org/drawingml/2006/main">
+              <a:graphicData uri="http://schemas.openxmlformats.org/drawingml/2006/picture">
+                <pic:pic xmlns:pic="http://schemas.openxmlformats.org/drawingml/2006/picture">
+                  <pic:nvPicPr>
+                    <pic:cNvPr id="1" name=""/>
+                    <pic:cNvPicPr/>
+                  </pic:nvPicPr>
+                  <pic:blipFill>
+                    <a:blip r:embed="rId20"/>
+                    <a:stretch>
+                      <a:fillRect/>
+                    </a:stretch>
+                  </pic:blipFill>
+                  <pic:spPr>
+                    <a:xfrm>
+                      <a:off x="0" y="0"/>
+                      <a:ext cx="6840220" cy="2948305"/>
+                    </a:xfrm>
+                    <a:prstGeom prst="rect">
+                      <a:avLst/>
+                    </a:prstGeom>
+                  </pic:spPr>
+                </pic:pic>
+              </a:graphicData>
+            </a:graphic>
+          </wp:inline>
+        </w:drawing>
+      </w:r>
+    </w:p>
+    <w:p>
+      <w:r>
+        <w:t xml:space="preserve">It is possible that all the </w:t>
+      </w:r>
+      <w:r>
+        <w:t>equilibria of each state variable</w:t>
+      </w:r>
+      <w:r>
+        <w:t xml:space="preserve"> are feasible</w:t>
+      </w:r>
+      <w:r>
+        <w:t>,</w:t>
+      </w:r>
+      <w:r>
+        <w:t xml:space="preserve"> but</w:t>
+      </w:r>
+      <w:r>
+        <w:t xml:space="preserve"> the equilibrium is</w:t>
+      </w:r>
+      <w:r>
+        <w:t xml:space="preserve"> unstable.</w:t>
+      </w:r>
+    </w:p>
+    <w:p>
+      <w:r>
+        <w:t>Under such a parameter set, the system will cycle.</w:t>
+      </w:r>
+    </w:p>
+    <w:p>
+      <w:r>
+        <w:rPr>
+          <w:noProof/>
+        </w:rPr>
+        <w:drawing>
+          <wp:inline distT="0" distB="0" distL="0" distR="0" wp14:anchorId="5F059D87">
+            <wp:extent cx="6223257" cy="3533775"/>
+            <wp:effectExtent l="0" t="0" r="6350" b="0"/>
+            <wp:docPr id="22" name="圖片 22"/>
+            <wp:cNvGraphicFramePr>
+              <a:graphicFrameLocks xmlns:a="http://schemas.openxmlformats.org/drawingml/2006/main" noChangeAspect="1"/>
+            </wp:cNvGraphicFramePr>
+            <a:graphic xmlns:a="http://schemas.openxmlformats.org/drawingml/2006/main">
+              <a:graphicData uri="http://schemas.openxmlformats.org/drawingml/2006/picture">
+                <pic:pic xmlns:pic="http://schemas.openxmlformats.org/drawingml/2006/picture">
+                  <pic:nvPicPr>
+                    <pic:cNvPr id="0" name="Picture 4"/>
+                    <pic:cNvPicPr>
+                      <a:picLocks noChangeAspect="1" noChangeArrowheads="1"/>
+                    </pic:cNvPicPr>
+                  </pic:nvPicPr>
+                  <pic:blipFill>
+                    <a:blip r:embed="rId21">
+                      <a:extLst>
+                        <a:ext uri="{28A0092B-C50C-407E-A947-70E740481C1C}">
+                          <a14:useLocalDpi xmlns:a14="http://schemas.microsoft.com/office/drawing/2010/main" val="0"/>
+                        </a:ext>
+                      </a:extLst>
+                    </a:blip>
+                    <a:srcRect/>
+                    <a:stretch>
+                      <a:fillRect/>
+                    </a:stretch>
+                  </pic:blipFill>
+                  <pic:spPr bwMode="auto">
+                    <a:xfrm>
+                      <a:off x="0" y="0"/>
+                      <a:ext cx="6255156" cy="3551889"/>
+                    </a:xfrm>
+                    <a:prstGeom prst="rect">
+                      <a:avLst/>
+                    </a:prstGeom>
+                    <a:noFill/>
+                  </pic:spPr>
+                </pic:pic>
+              </a:graphicData>
+            </a:graphic>
+          </wp:inline>
+        </w:drawing>
       </w:r>
     </w:p>
     <w:sectPr>
@@ -1600,6 +1751,44 @@
     </w:sectPr>
   </w:body>
 </w:document>
+</file>
+
+<file path=word/endnotes.xml><?xml version="1.0" encoding="utf-8"?>
+<w:endnotes xmlns:wpc="http://schemas.microsoft.com/office/word/2010/wordprocessingCanvas" xmlns:cx="http://schemas.microsoft.com/office/drawing/2014/chartex" xmlns:cx1="http://schemas.microsoft.com/office/drawing/2015/9/8/chartex" xmlns:cx2="http://schemas.microsoft.com/office/drawing/2015/10/21/chartex" xmlns:cx3="http://schemas.microsoft.com/office/drawing/2016/5/9/chartex" xmlns:cx4="http://schemas.microsoft.com/office/drawing/2016/5/10/chartex" xmlns:cx5="http://schemas.microsoft.com/office/drawing/2016/5/11/chartex" xmlns:cx6="http://schemas.microsoft.com/office/drawing/2016/5/12/chartex" xmlns:cx7="http://schemas.microsoft.com/office/drawing/2016/5/13/chartex" xmlns:cx8="http://schemas.microsoft.com/office/drawing/2016/5/14/chartex" xmlns:mc="http://schemas.openxmlformats.org/markup-compatibility/2006" xmlns:aink="http://schemas.microsoft.com/office/drawing/2016/ink" xmlns:am3d="http://schemas.microsoft.com/office/drawing/2017/model3d" xmlns:o="urn:schemas-microsoft-com:office:office" xmlns:r="http://schemas.openxmlformats.org/officeDocument/2006/relationships" xmlns:m="http://schemas.openxmlformats.org/officeDocument/2006/math" xmlns:v="urn:schemas-microsoft-com:vml" xmlns:wp14="http://schemas.microsoft.com/office/word/2010/wordprocessingDrawing" xmlns:wp="http://schemas.openxmlformats.org/drawingml/2006/wordprocessingDrawing" xmlns:w10="urn:schemas-microsoft-com:office:word" xmlns:w="http://schemas.openxmlformats.org/wordprocessingml/2006/main" xmlns:w14="http://schemas.microsoft.com/office/word/2010/wordml" xmlns:w15="http://schemas.microsoft.com/office/word/2012/wordml" xmlns:w16cid="http://schemas.microsoft.com/office/word/2016/wordml/cid" xmlns:w16se="http://schemas.microsoft.com/office/word/2015/wordml/symex" xmlns:wpg="http://schemas.microsoft.com/office/word/2010/wordprocessingGroup" xmlns:wpi="http://schemas.microsoft.com/office/word/2010/wordprocessingInk" xmlns:wne="http://schemas.microsoft.com/office/word/2006/wordml" xmlns:wps="http://schemas.microsoft.com/office/word/2010/wordprocessingShape" mc:Ignorable="w14 w15 w16se w16cid wp14">
+  <w:endnote w:type="separator" w:id="-1">
+    <w:p>
+      <w:r>
+        <w:separator/>
+      </w:r>
+    </w:p>
+  </w:endnote>
+  <w:endnote w:type="continuationSeparator" w:id="0">
+    <w:p>
+      <w:r>
+        <w:continuationSeparator/>
+      </w:r>
+    </w:p>
+  </w:endnote>
+</w:endnotes>
+</file>
+
+<file path=word/footnotes.xml><?xml version="1.0" encoding="utf-8"?>
+<w:footnotes xmlns:wpc="http://schemas.microsoft.com/office/word/2010/wordprocessingCanvas" xmlns:cx="http://schemas.microsoft.com/office/drawing/2014/chartex" xmlns:cx1="http://schemas.microsoft.com/office/drawing/2015/9/8/chartex" xmlns:cx2="http://schemas.microsoft.com/office/drawing/2015/10/21/chartex" xmlns:cx3="http://schemas.microsoft.com/office/drawing/2016/5/9/chartex" xmlns:cx4="http://schemas.microsoft.com/office/drawing/2016/5/10/chartex" xmlns:cx5="http://schemas.microsoft.com/office/drawing/2016/5/11/chartex" xmlns:cx6="http://schemas.microsoft.com/office/drawing/2016/5/12/chartex" xmlns:cx7="http://schemas.microsoft.com/office/drawing/2016/5/13/chartex" xmlns:cx8="http://schemas.microsoft.com/office/drawing/2016/5/14/chartex" xmlns:mc="http://schemas.openxmlformats.org/markup-compatibility/2006" xmlns:aink="http://schemas.microsoft.com/office/drawing/2016/ink" xmlns:am3d="http://schemas.microsoft.com/office/drawing/2017/model3d" xmlns:o="urn:schemas-microsoft-com:office:office" xmlns:r="http://schemas.openxmlformats.org/officeDocument/2006/relationships" xmlns:m="http://schemas.openxmlformats.org/officeDocument/2006/math" xmlns:v="urn:schemas-microsoft-com:vml" xmlns:wp14="http://schemas.microsoft.com/office/word/2010/wordprocessingDrawing" xmlns:wp="http://schemas.openxmlformats.org/drawingml/2006/wordprocessingDrawing" xmlns:w10="urn:schemas-microsoft-com:office:word" xmlns:w="http://schemas.openxmlformats.org/wordprocessingml/2006/main" xmlns:w14="http://schemas.microsoft.com/office/word/2010/wordml" xmlns:w15="http://schemas.microsoft.com/office/word/2012/wordml" xmlns:w16cid="http://schemas.microsoft.com/office/word/2016/wordml/cid" xmlns:w16se="http://schemas.microsoft.com/office/word/2015/wordml/symex" xmlns:wpg="http://schemas.microsoft.com/office/word/2010/wordprocessingGroup" xmlns:wpi="http://schemas.microsoft.com/office/word/2010/wordprocessingInk" xmlns:wne="http://schemas.microsoft.com/office/word/2006/wordml" xmlns:wps="http://schemas.microsoft.com/office/word/2010/wordprocessingShape" mc:Ignorable="w14 w15 w16se w16cid wp14">
+  <w:footnote w:type="separator" w:id="-1">
+    <w:p>
+      <w:r>
+        <w:separator/>
+      </w:r>
+    </w:p>
+  </w:footnote>
+  <w:footnote w:type="continuationSeparator" w:id="0">
+    <w:p>
+      <w:r>
+        <w:continuationSeparator/>
+      </w:r>
+    </w:p>
+  </w:footnote>
+</w:footnotes>
 </file>
 
 <file path=word/styles.xml><?xml version="1.0" encoding="utf-8"?>
@@ -2028,6 +2217,76 @@
     <w:semiHidden/>
     <w:unhideWhenUsed/>
   </w:style>
+  <w:style w:type="paragraph" w:styleId="a3">
+    <w:name w:val="header"/>
+    <w:basedOn w:val="a"/>
+    <w:link w:val="a4"/>
+    <w:uiPriority w:val="99"/>
+    <w:unhideWhenUsed/>
+    <w:rsid w:val="00172B41"/>
+    <w:pPr>
+      <w:tabs>
+        <w:tab w:val="center" w:pos="4153"/>
+        <w:tab w:val="right" w:pos="8306"/>
+      </w:tabs>
+      <w:snapToGrid w:val="0"/>
+    </w:pPr>
+    <w:rPr>
+      <w:sz w:val="20"/>
+      <w:szCs w:val="20"/>
+    </w:rPr>
+  </w:style>
+  <w:style w:type="character" w:customStyle="1" w:styleId="a4">
+    <w:name w:val="頁首 字元"/>
+    <w:basedOn w:val="a0"/>
+    <w:link w:val="a3"/>
+    <w:uiPriority w:val="99"/>
+    <w:rsid w:val="00172B41"/>
+    <w:rPr>
+      <w:sz w:val="20"/>
+      <w:szCs w:val="20"/>
+    </w:rPr>
+  </w:style>
+  <w:style w:type="paragraph" w:styleId="a5">
+    <w:name w:val="footer"/>
+    <w:basedOn w:val="a"/>
+    <w:link w:val="a6"/>
+    <w:uiPriority w:val="99"/>
+    <w:unhideWhenUsed/>
+    <w:rsid w:val="00172B41"/>
+    <w:pPr>
+      <w:tabs>
+        <w:tab w:val="center" w:pos="4153"/>
+        <w:tab w:val="right" w:pos="8306"/>
+      </w:tabs>
+      <w:snapToGrid w:val="0"/>
+    </w:pPr>
+    <w:rPr>
+      <w:sz w:val="20"/>
+      <w:szCs w:val="20"/>
+    </w:rPr>
+  </w:style>
+  <w:style w:type="character" w:customStyle="1" w:styleId="a6">
+    <w:name w:val="頁尾 字元"/>
+    <w:basedOn w:val="a0"/>
+    <w:link w:val="a5"/>
+    <w:uiPriority w:val="99"/>
+    <w:rsid w:val="00172B41"/>
+    <w:rPr>
+      <w:sz w:val="20"/>
+      <w:szCs w:val="20"/>
+    </w:rPr>
+  </w:style>
+  <w:style w:type="character" w:styleId="a7">
+    <w:name w:val="Placeholder Text"/>
+    <w:basedOn w:val="a0"/>
+    <w:uiPriority w:val="99"/>
+    <w:semiHidden/>
+    <w:rsid w:val="0089173B"/>
+    <w:rPr>
+      <w:color w:val="808080"/>
+    </w:rPr>
+  </w:style>
 </w:styles>
 </file>
 

</xml_diff>